<commit_message>
Improvements on EDA and documentation
</commit_message>
<xml_diff>
--- a/docs/Domain Understanding.docx
+++ b/docs/Domain Understanding.docx
@@ -85,7 +85,7 @@
           <w:r>
             <w:fldChar w:fldCharType="separate"/>
           </w:r>
-          <w:hyperlink w:anchor="_Toc240296924" w:history="1">
+          <w:hyperlink w:anchor="_Toc240551870" w:history="1">
             <w:r>
               <w:rPr>
                 <w:rStyle w:val="Hyperlink"/>
@@ -112,7 +112,7 @@
                 <w:noProof/>
                 <w:webHidden/>
               </w:rPr>
-              <w:instrText xml:space="preserve"> PAGEREF _Toc240296924 \h </w:instrText>
+              <w:instrText xml:space="preserve"> PAGEREF _Toc240551870 \h </w:instrText>
             </w:r>
             <w:r>
               <w:rPr>
@@ -155,7 +155,7 @@
               <w:lang w:eastAsia="en-GB"/>
             </w:rPr>
           </w:pPr>
-          <w:hyperlink w:anchor="_Toc240296925" w:history="1">
+          <w:hyperlink w:anchor="_Toc240551871" w:history="1">
             <w:r>
               <w:rPr>
                 <w:rStyle w:val="Hyperlink"/>
@@ -182,7 +182,7 @@
                 <w:noProof/>
                 <w:webHidden/>
               </w:rPr>
-              <w:instrText xml:space="preserve"> PAGEREF _Toc240296925 \h </w:instrText>
+              <w:instrText xml:space="preserve"> PAGEREF _Toc240551871 \h </w:instrText>
             </w:r>
             <w:r>
               <w:rPr>
@@ -225,7 +225,7 @@
               <w:lang w:eastAsia="en-GB"/>
             </w:rPr>
           </w:pPr>
-          <w:hyperlink w:anchor="_Toc240296926" w:history="1">
+          <w:hyperlink w:anchor="_Toc240551872" w:history="1">
             <w:r>
               <w:rPr>
                 <w:rStyle w:val="Hyperlink"/>
@@ -252,7 +252,7 @@
                 <w:noProof/>
                 <w:webHidden/>
               </w:rPr>
-              <w:instrText xml:space="preserve"> PAGEREF _Toc240296926 \h </w:instrText>
+              <w:instrText xml:space="preserve"> PAGEREF _Toc240551872 \h </w:instrText>
             </w:r>
             <w:r>
               <w:rPr>
@@ -295,7 +295,7 @@
               <w:lang w:eastAsia="en-GB"/>
             </w:rPr>
           </w:pPr>
-          <w:hyperlink w:anchor="_Toc240296927" w:history="1">
+          <w:hyperlink w:anchor="_Toc240551873" w:history="1">
             <w:r>
               <w:rPr>
                 <w:rStyle w:val="Hyperlink"/>
@@ -322,7 +322,7 @@
                 <w:noProof/>
                 <w:webHidden/>
               </w:rPr>
-              <w:instrText xml:space="preserve"> PAGEREF _Toc240296927 \h </w:instrText>
+              <w:instrText xml:space="preserve"> PAGEREF _Toc240551873 \h </w:instrText>
             </w:r>
             <w:r>
               <w:rPr>
@@ -365,7 +365,7 @@
               <w:lang w:eastAsia="en-GB"/>
             </w:rPr>
           </w:pPr>
-          <w:hyperlink w:anchor="_Toc240296928" w:history="1">
+          <w:hyperlink w:anchor="_Toc240551874" w:history="1">
             <w:r>
               <w:rPr>
                 <w:rStyle w:val="Hyperlink"/>
@@ -392,7 +392,7 @@
                 <w:noProof/>
                 <w:webHidden/>
               </w:rPr>
-              <w:instrText xml:space="preserve"> PAGEREF _Toc240296928 \h </w:instrText>
+              <w:instrText xml:space="preserve"> PAGEREF _Toc240551874 \h </w:instrText>
             </w:r>
             <w:r>
               <w:rPr>
@@ -412,7 +412,7 @@
                 <w:noProof/>
                 <w:webHidden/>
               </w:rPr>
-              <w:t>3</w:t>
+              <w:t>2</w:t>
             </w:r>
             <w:r>
               <w:rPr>
@@ -435,7 +435,7 @@
               <w:lang w:eastAsia="en-GB"/>
             </w:rPr>
           </w:pPr>
-          <w:hyperlink w:anchor="_Toc240296929" w:history="1">
+          <w:hyperlink w:anchor="_Toc240551875" w:history="1">
             <w:r>
               <w:rPr>
                 <w:rStyle w:val="Hyperlink"/>
@@ -462,7 +462,7 @@
                 <w:noProof/>
                 <w:webHidden/>
               </w:rPr>
-              <w:instrText xml:space="preserve"> PAGEREF _Toc240296929 \h </w:instrText>
+              <w:instrText xml:space="preserve"> PAGEREF _Toc240551875 \h </w:instrText>
             </w:r>
             <w:r>
               <w:rPr>
@@ -505,7 +505,7 @@
               <w:lang w:eastAsia="en-GB"/>
             </w:rPr>
           </w:pPr>
-          <w:hyperlink w:anchor="_Toc240296930" w:history="1">
+          <w:hyperlink w:anchor="_Toc240551876" w:history="1">
             <w:r>
               <w:rPr>
                 <w:rStyle w:val="Hyperlink"/>
@@ -532,7 +532,7 @@
                 <w:noProof/>
                 <w:webHidden/>
               </w:rPr>
-              <w:instrText xml:space="preserve"> PAGEREF _Toc240296930 \h </w:instrText>
+              <w:instrText xml:space="preserve"> PAGEREF _Toc240551876 \h </w:instrText>
             </w:r>
             <w:r>
               <w:rPr>
@@ -575,7 +575,7 @@
               <w:lang w:eastAsia="en-GB"/>
             </w:rPr>
           </w:pPr>
-          <w:hyperlink w:anchor="_Toc240296931" w:history="1">
+          <w:hyperlink w:anchor="_Toc240551877" w:history="1">
             <w:r>
               <w:rPr>
                 <w:rStyle w:val="Hyperlink"/>
@@ -602,7 +602,7 @@
                 <w:noProof/>
                 <w:webHidden/>
               </w:rPr>
-              <w:instrText xml:space="preserve"> PAGEREF _Toc240296931 \h </w:instrText>
+              <w:instrText xml:space="preserve"> PAGEREF _Toc240551877 \h </w:instrText>
             </w:r>
             <w:r>
               <w:rPr>
@@ -645,7 +645,7 @@
               <w:lang w:eastAsia="en-GB"/>
             </w:rPr>
           </w:pPr>
-          <w:hyperlink w:anchor="_Toc240296932" w:history="1">
+          <w:hyperlink w:anchor="_Toc240551878" w:history="1">
             <w:r>
               <w:rPr>
                 <w:rStyle w:val="Hyperlink"/>
@@ -672,7 +672,7 @@
                 <w:noProof/>
                 <w:webHidden/>
               </w:rPr>
-              <w:instrText xml:space="preserve"> PAGEREF _Toc240296932 \h </w:instrText>
+              <w:instrText xml:space="preserve"> PAGEREF _Toc240551878 \h </w:instrText>
             </w:r>
             <w:r>
               <w:rPr>
@@ -715,7 +715,7 @@
               <w:lang w:eastAsia="en-GB"/>
             </w:rPr>
           </w:pPr>
-          <w:hyperlink w:anchor="_Toc240296933" w:history="1">
+          <w:hyperlink w:anchor="_Toc240551879" w:history="1">
             <w:r>
               <w:rPr>
                 <w:rStyle w:val="Hyperlink"/>
@@ -742,7 +742,7 @@
                 <w:noProof/>
                 <w:webHidden/>
               </w:rPr>
-              <w:instrText xml:space="preserve"> PAGEREF _Toc240296933 \h </w:instrText>
+              <w:instrText xml:space="preserve"> PAGEREF _Toc240551879 \h </w:instrText>
             </w:r>
             <w:r>
               <w:rPr>
@@ -785,7 +785,7 @@
               <w:lang w:eastAsia="en-GB"/>
             </w:rPr>
           </w:pPr>
-          <w:hyperlink w:anchor="_Toc240296934" w:history="1">
+          <w:hyperlink w:anchor="_Toc240551880" w:history="1">
             <w:r>
               <w:rPr>
                 <w:rStyle w:val="Hyperlink"/>
@@ -812,7 +812,7 @@
                 <w:noProof/>
                 <w:webHidden/>
               </w:rPr>
-              <w:instrText xml:space="preserve"> PAGEREF _Toc240296934 \h </w:instrText>
+              <w:instrText xml:space="preserve"> PAGEREF _Toc240551880 \h </w:instrText>
             </w:r>
             <w:r>
               <w:rPr>
@@ -855,7 +855,7 @@
               <w:lang w:eastAsia="en-GB"/>
             </w:rPr>
           </w:pPr>
-          <w:hyperlink w:anchor="_Toc240296935" w:history="1">
+          <w:hyperlink w:anchor="_Toc240551881" w:history="1">
             <w:r>
               <w:rPr>
                 <w:rStyle w:val="Hyperlink"/>
@@ -882,7 +882,7 @@
                 <w:noProof/>
                 <w:webHidden/>
               </w:rPr>
-              <w:instrText xml:space="preserve"> PAGEREF _Toc240296935 \h </w:instrText>
+              <w:instrText xml:space="preserve"> PAGEREF _Toc240551881 \h </w:instrText>
             </w:r>
             <w:r>
               <w:rPr>
@@ -925,7 +925,7 @@
               <w:lang w:eastAsia="en-GB"/>
             </w:rPr>
           </w:pPr>
-          <w:hyperlink w:anchor="_Toc240296936" w:history="1">
+          <w:hyperlink w:anchor="_Toc240551882" w:history="1">
             <w:r>
               <w:rPr>
                 <w:rStyle w:val="Hyperlink"/>
@@ -952,7 +952,7 @@
                 <w:noProof/>
                 <w:webHidden/>
               </w:rPr>
-              <w:instrText xml:space="preserve"> PAGEREF _Toc240296936 \h </w:instrText>
+              <w:instrText xml:space="preserve"> PAGEREF _Toc240551882 \h </w:instrText>
             </w:r>
             <w:r>
               <w:rPr>
@@ -995,7 +995,7 @@
               <w:lang w:eastAsia="en-GB"/>
             </w:rPr>
           </w:pPr>
-          <w:hyperlink w:anchor="_Toc240296937" w:history="1">
+          <w:hyperlink w:anchor="_Toc240551883" w:history="1">
             <w:r>
               <w:rPr>
                 <w:rStyle w:val="Hyperlink"/>
@@ -1022,7 +1022,7 @@
                 <w:noProof/>
                 <w:webHidden/>
               </w:rPr>
-              <w:instrText xml:space="preserve"> PAGEREF _Toc240296937 \h </w:instrText>
+              <w:instrText xml:space="preserve"> PAGEREF _Toc240551883 \h </w:instrText>
             </w:r>
             <w:r>
               <w:rPr>
@@ -1065,7 +1065,7 @@
               <w:lang w:eastAsia="en-GB"/>
             </w:rPr>
           </w:pPr>
-          <w:hyperlink w:anchor="_Toc240296938" w:history="1">
+          <w:hyperlink w:anchor="_Toc240551884" w:history="1">
             <w:r>
               <w:rPr>
                 <w:rStyle w:val="Hyperlink"/>
@@ -1092,7 +1092,7 @@
                 <w:noProof/>
                 <w:webHidden/>
               </w:rPr>
-              <w:instrText xml:space="preserve"> PAGEREF _Toc240296938 \h </w:instrText>
+              <w:instrText xml:space="preserve"> PAGEREF _Toc240551884 \h </w:instrText>
             </w:r>
             <w:r>
               <w:rPr>
@@ -1135,7 +1135,7 @@
               <w:lang w:eastAsia="en-GB"/>
             </w:rPr>
           </w:pPr>
-          <w:hyperlink w:anchor="_Toc240296939" w:history="1">
+          <w:hyperlink w:anchor="_Toc240551885" w:history="1">
             <w:r>
               <w:rPr>
                 <w:rStyle w:val="Hyperlink"/>
@@ -1162,7 +1162,7 @@
                 <w:noProof/>
                 <w:webHidden/>
               </w:rPr>
-              <w:instrText xml:space="preserve"> PAGEREF _Toc240296939 \h </w:instrText>
+              <w:instrText xml:space="preserve"> PAGEREF _Toc240551885 \h </w:instrText>
             </w:r>
             <w:r>
               <w:rPr>
@@ -1205,7 +1205,7 @@
               <w:lang w:eastAsia="en-GB"/>
             </w:rPr>
           </w:pPr>
-          <w:hyperlink w:anchor="_Toc240296940" w:history="1">
+          <w:hyperlink w:anchor="_Toc240551886" w:history="1">
             <w:r>
               <w:rPr>
                 <w:rStyle w:val="Hyperlink"/>
@@ -1232,7 +1232,7 @@
                 <w:noProof/>
                 <w:webHidden/>
               </w:rPr>
-              <w:instrText xml:space="preserve"> PAGEREF _Toc240296940 \h </w:instrText>
+              <w:instrText xml:space="preserve"> PAGEREF _Toc240551886 \h </w:instrText>
             </w:r>
             <w:r>
               <w:rPr>
@@ -1275,7 +1275,7 @@
               <w:lang w:eastAsia="en-GB"/>
             </w:rPr>
           </w:pPr>
-          <w:hyperlink w:anchor="_Toc240296941" w:history="1">
+          <w:hyperlink w:anchor="_Toc240551887" w:history="1">
             <w:r>
               <w:rPr>
                 <w:rStyle w:val="Hyperlink"/>
@@ -1302,7 +1302,7 @@
                 <w:noProof/>
                 <w:webHidden/>
               </w:rPr>
-              <w:instrText xml:space="preserve"> PAGEREF _Toc240296941 \h </w:instrText>
+              <w:instrText xml:space="preserve"> PAGEREF _Toc240551887 \h </w:instrText>
             </w:r>
             <w:r>
               <w:rPr>
@@ -1345,7 +1345,7 @@
               <w:lang w:eastAsia="en-GB"/>
             </w:rPr>
           </w:pPr>
-          <w:hyperlink w:anchor="_Toc240296942" w:history="1">
+          <w:hyperlink w:anchor="_Toc240551888" w:history="1">
             <w:r>
               <w:rPr>
                 <w:rStyle w:val="Hyperlink"/>
@@ -1372,7 +1372,7 @@
                 <w:noProof/>
                 <w:webHidden/>
               </w:rPr>
-              <w:instrText xml:space="preserve"> PAGEREF _Toc240296942 \h </w:instrText>
+              <w:instrText xml:space="preserve"> PAGEREF _Toc240551888 \h </w:instrText>
             </w:r>
             <w:r>
               <w:rPr>
@@ -1415,7 +1415,7 @@
               <w:lang w:eastAsia="en-GB"/>
             </w:rPr>
           </w:pPr>
-          <w:hyperlink w:anchor="_Toc240296943" w:history="1">
+          <w:hyperlink w:anchor="_Toc240551889" w:history="1">
             <w:r>
               <w:rPr>
                 <w:rStyle w:val="Hyperlink"/>
@@ -1442,147 +1442,7 @@
                 <w:noProof/>
                 <w:webHidden/>
               </w:rPr>
-              <w:instrText xml:space="preserve"> PAGEREF _Toc240296943 \h </w:instrText>
-            </w:r>
-            <w:r>
-              <w:rPr>
-                <w:noProof/>
-                <w:webHidden/>
-              </w:rPr>
-            </w:r>
-            <w:r>
-              <w:rPr>
-                <w:noProof/>
-                <w:webHidden/>
-              </w:rPr>
-              <w:fldChar w:fldCharType="separate"/>
-            </w:r>
-            <w:r>
-              <w:rPr>
-                <w:noProof/>
-                <w:webHidden/>
-              </w:rPr>
-              <w:t>6</w:t>
-            </w:r>
-            <w:r>
-              <w:rPr>
-                <w:noProof/>
-                <w:webHidden/>
-              </w:rPr>
-              <w:fldChar w:fldCharType="end"/>
-            </w:r>
-          </w:hyperlink>
-        </w:p>
-        <w:p>
-          <w:pPr>
-            <w:pStyle w:val="TOC2"/>
-            <w:tabs>
-              <w:tab w:val="right" w:leader="dot" w:pos="9016"/>
-            </w:tabs>
-            <w:rPr>
-              <w:rFonts w:eastAsiaTheme="minorEastAsia"/>
-              <w:noProof/>
-              <w:lang w:eastAsia="en-GB"/>
-            </w:rPr>
-          </w:pPr>
-          <w:hyperlink w:anchor="_Toc240296944" w:history="1">
-            <w:r>
-              <w:rPr>
-                <w:rStyle w:val="Hyperlink"/>
-                <w:noProof/>
-              </w:rPr>
-              <w:t>Domain Documents/Methods</w:t>
-            </w:r>
-            <w:r>
-              <w:rPr>
-                <w:noProof/>
-                <w:webHidden/>
-              </w:rPr>
-              <w:tab/>
-            </w:r>
-            <w:r>
-              <w:rPr>
-                <w:noProof/>
-                <w:webHidden/>
-              </w:rPr>
-              <w:fldChar w:fldCharType="begin"/>
-            </w:r>
-            <w:r>
-              <w:rPr>
-                <w:noProof/>
-                <w:webHidden/>
-              </w:rPr>
-              <w:instrText xml:space="preserve"> PAGEREF _Toc240296944 \h </w:instrText>
-            </w:r>
-            <w:r>
-              <w:rPr>
-                <w:noProof/>
-                <w:webHidden/>
-              </w:rPr>
-            </w:r>
-            <w:r>
-              <w:rPr>
-                <w:noProof/>
-                <w:webHidden/>
-              </w:rPr>
-              <w:fldChar w:fldCharType="separate"/>
-            </w:r>
-            <w:r>
-              <w:rPr>
-                <w:noProof/>
-                <w:webHidden/>
-              </w:rPr>
-              <w:t>6</w:t>
-            </w:r>
-            <w:r>
-              <w:rPr>
-                <w:noProof/>
-                <w:webHidden/>
-              </w:rPr>
-              <w:fldChar w:fldCharType="end"/>
-            </w:r>
-          </w:hyperlink>
-        </w:p>
-        <w:p>
-          <w:pPr>
-            <w:pStyle w:val="TOC2"/>
-            <w:tabs>
-              <w:tab w:val="right" w:leader="dot" w:pos="9016"/>
-            </w:tabs>
-            <w:rPr>
-              <w:rFonts w:eastAsiaTheme="minorEastAsia"/>
-              <w:noProof/>
-              <w:lang w:eastAsia="en-GB"/>
-            </w:rPr>
-          </w:pPr>
-          <w:hyperlink w:anchor="_Toc240296945" w:history="1">
-            <w:r>
-              <w:rPr>
-                <w:rStyle w:val="Hyperlink"/>
-                <w:noProof/>
-              </w:rPr>
-              <w:t>Datasets</w:t>
-            </w:r>
-            <w:r>
-              <w:rPr>
-                <w:noProof/>
-                <w:webHidden/>
-              </w:rPr>
-              <w:tab/>
-            </w:r>
-            <w:r>
-              <w:rPr>
-                <w:noProof/>
-                <w:webHidden/>
-              </w:rPr>
-              <w:fldChar w:fldCharType="begin"/>
-            </w:r>
-            <w:r>
-              <w:rPr>
-                <w:noProof/>
-                <w:webHidden/>
-              </w:rPr>
-              <w:instrText xml:space="preserve"> PAGEREF _Toc240296945 \h </w:instrText>
+              <w:instrText xml:space="preserve"> PAGEREF _Toc240551889 \h </w:instrText>
             </w:r>
             <w:r>
               <w:rPr>
@@ -1628,7 +1488,7 @@
       <w:pPr>
         <w:pStyle w:val="Heading1"/>
       </w:pPr>
-      <w:bookmarkStart w:id="0" w:name="_Toc240296924"/>
+      <w:bookmarkStart w:id="0" w:name="_Toc240551870"/>
       <w:r>
         <w:t>Introduction</w:t>
       </w:r>
@@ -1636,22 +1496,13 @@
     </w:p>
     <w:p>
       <w:r>
-        <w:t>Formula 1 is a racing sport in which small differences in laps can have an impact on race performance and strategy decisions. Driver’s laps are influenced by tyre degradation, weather conditions, fuel load, racetrack conditions, traffic, car performance and driver skill.</w:t>
+        <w:t>Formula 1 is a racing sport in which small differences in laps can have an impact on race performance and strategy decisions. Driver’s laps are influenced by tyre degradation, weather conditions, fuel load, racetrack conditions, traffic, car performance and driver skill (Pendharkar et al., 2025; Cappello &amp; Hoegh, 2026). Fuel load is relevant to the domain, but it is not directly available in the selected FastF1 data, so it will not be used as a measured feature.</w:t>
       </w:r>
     </w:p>
     <w:p>
       <w:r>
         <w:lastRenderedPageBreak/>
-        <w:t>Being able to estimate a driver’s next lap is helpful to understand race pace and how different race conditions and moments affect overall performance. Due to this, it is obvious that lap times are not constant throughout the stage, which make</w:t>
-      </w:r>
-      <w:r>
-        <w:t>s</w:t>
-      </w:r>
-      <w:r>
-        <w:t xml:space="preserve"> prediction difficult.</w:t>
-      </w:r>
-      <w:r>
-        <w:t xml:space="preserve"> Tyres degrade, weather changes, pilots appears on track and make it harder to be faster.  Special events such as red flags (race stops), safety cars and virtual safety cars or pit stops affect lap times also, so a special attention needs to be taken for this events.</w:t>
+        <w:t>Being able to estimate a driver’s next lap is helpful to understand race pace. In this project, information available at the end of lap t will be used to predict the same driver’s lap t+1. Pit stops, Safety Cars, Virtual Safety Cars and red flags affect lap times (Sasikumar et al., 2025), so these laps need separate handling. Only race sessions are in scope, not qualifying, practice or sprint sessions.</w:t>
       </w:r>
     </w:p>
     <w:p>
@@ -1699,7 +1550,7 @@
       <w:pPr>
         <w:pStyle w:val="Heading1"/>
       </w:pPr>
-      <w:bookmarkStart w:id="1" w:name="_Toc240296925"/>
+      <w:bookmarkStart w:id="1" w:name="_Toc240551871"/>
       <w:r>
         <w:t>Project Overview</w:t>
       </w:r>
@@ -1930,7 +1781,7 @@
       <w:pPr>
         <w:pStyle w:val="Heading1"/>
       </w:pPr>
-      <w:bookmarkStart w:id="2" w:name="_Toc240296926"/>
+      <w:bookmarkStart w:id="2" w:name="_Toc240551872"/>
       <w:proofErr w:type="spellStart"/>
       <w:r>
         <w:t>MoSCoW</w:t>
@@ -1945,7 +1796,7 @@
       <w:pPr>
         <w:pStyle w:val="Heading2"/>
       </w:pPr>
-      <w:bookmarkStart w:id="3" w:name="_Toc240296927"/>
+      <w:bookmarkStart w:id="3" w:name="_Toc240551873"/>
       <w:r>
         <w:t>Must-Have:</w:t>
       </w:r>
@@ -2015,9 +1866,8 @@
       <w:pPr>
         <w:pStyle w:val="Heading2"/>
       </w:pPr>
-      <w:bookmarkStart w:id="4" w:name="_Toc240296928"/>
-      <w:r>
-        <w:lastRenderedPageBreak/>
+      <w:bookmarkStart w:id="4" w:name="_Toc240551874"/>
+      <w:r>
         <w:t>Should-Have:</w:t>
       </w:r>
       <w:bookmarkEnd w:id="4"/>
@@ -2055,6 +1905,7 @@
         </w:numPr>
       </w:pPr>
       <w:r>
+        <w:lastRenderedPageBreak/>
         <w:t>Ensure personal data is under GDPR legislation</w:t>
       </w:r>
     </w:p>
@@ -2062,7 +1913,7 @@
       <w:pPr>
         <w:pStyle w:val="Heading2"/>
       </w:pPr>
-      <w:bookmarkStart w:id="5" w:name="_Toc240296929"/>
+      <w:bookmarkStart w:id="5" w:name="_Toc240551875"/>
       <w:r>
         <w:t>Could-Have:</w:t>
       </w:r>
@@ -2120,7 +1971,7 @@
       <w:pPr>
         <w:pStyle w:val="Heading2"/>
       </w:pPr>
-      <w:bookmarkStart w:id="6" w:name="_Toc240296930"/>
+      <w:bookmarkStart w:id="6" w:name="_Toc240551876"/>
       <w:r>
         <w:t>Won’t Have:</w:t>
       </w:r>
@@ -2183,7 +2034,7 @@
       <w:pPr>
         <w:pStyle w:val="Heading1"/>
       </w:pPr>
-      <w:bookmarkStart w:id="7" w:name="_Toc240296931"/>
+      <w:bookmarkStart w:id="7" w:name="_Toc240551877"/>
       <w:r>
         <w:t>Possible Stakeholders</w:t>
       </w:r>
@@ -2193,7 +2044,7 @@
       <w:pPr>
         <w:pStyle w:val="Heading2"/>
       </w:pPr>
-      <w:bookmarkStart w:id="8" w:name="_Toc240296932"/>
+      <w:bookmarkStart w:id="8" w:name="_Toc240551878"/>
       <w:r>
         <w:t>Primary Stakeholders</w:t>
       </w:r>
@@ -2208,7 +2059,7 @@
       <w:pPr>
         <w:pStyle w:val="Heading2"/>
       </w:pPr>
-      <w:bookmarkStart w:id="9" w:name="_Toc240296933"/>
+      <w:bookmarkStart w:id="9" w:name="_Toc240551879"/>
       <w:r>
         <w:t>Academic Stakeholders</w:t>
       </w:r>
@@ -2223,7 +2074,7 @@
       <w:pPr>
         <w:pStyle w:val="Heading1"/>
       </w:pPr>
-      <w:bookmarkStart w:id="10" w:name="_Toc240296934"/>
+      <w:bookmarkStart w:id="10" w:name="_Toc240551880"/>
       <w:r>
         <w:t>Research Question</w:t>
       </w:r>
@@ -2261,7 +2112,7 @@
       <w:pPr>
         <w:pStyle w:val="Heading1"/>
       </w:pPr>
-      <w:bookmarkStart w:id="11" w:name="_Toc240296935"/>
+      <w:bookmarkStart w:id="11" w:name="_Toc240551881"/>
       <w:r>
         <w:lastRenderedPageBreak/>
         <w:t>Research Method</w:t>
@@ -2272,7 +2123,7 @@
       <w:pPr>
         <w:pStyle w:val="Heading2"/>
       </w:pPr>
-      <w:bookmarkStart w:id="12" w:name="_Toc240296936"/>
+      <w:bookmarkStart w:id="12" w:name="_Toc240551882"/>
       <w:r>
         <w:t>Literature Study, Library</w:t>
       </w:r>
@@ -2298,7 +2149,7 @@
       <w:pPr>
         <w:pStyle w:val="Heading1"/>
       </w:pPr>
-      <w:bookmarkStart w:id="13" w:name="_Toc240296937"/>
+      <w:bookmarkStart w:id="13" w:name="_Toc240551883"/>
       <w:r>
         <w:t>Literature Findings and Comparison</w:t>
       </w:r>
@@ -2308,7 +2159,7 @@
       <w:pPr>
         <w:pStyle w:val="Heading2"/>
       </w:pPr>
-      <w:bookmarkStart w:id="14" w:name="_Toc240296938"/>
+      <w:bookmarkStart w:id="14" w:name="_Toc240551884"/>
       <w:r>
         <w:t>Key Findings</w:t>
       </w:r>
@@ -2369,26 +2220,26 @@
     </w:p>
     <w:p>
       <w:r>
-        <w:t xml:space="preserve">The three first factors are the main ones I will be analysing, as special events are occasional and do not provide a realistic lap time for the model (it will be an outlier and create lousiness in the data). </w:t>
-      </w:r>
-    </w:p>
-    <w:p>
-      <w:r>
-        <w:t>The studies also show that FastF1 provides useful data, as it has lap times, tyre information, race conditions and telemetry. All of this will be considered into my dataset.</w:t>
+        <w:t>These factors are relevant to the domain, but not all can be measured directly. Fuel load is not directly available in FastF1, so it will not be treated as a measured feature. Pit, Safety Car, VSC and invalid laps are real data but do not represent normal racing pace, so they need separate handling.</w:t>
+      </w:r>
+    </w:p>
+    <w:p>
+      <w:r>
+        <w:t>FastF1 provides lap times, tyre information, weather, race conditions and telemetry (FastF1 contributors, n.d.). These can be analysed in the EDA, but only information available at the end of lap t can be used to predict lap t+1.</w:t>
       </w:r>
     </w:p>
     <w:p>
       <w:pPr>
         <w:pStyle w:val="Heading2"/>
       </w:pPr>
-      <w:bookmarkStart w:id="15" w:name="_Toc240296939"/>
+      <w:bookmarkStart w:id="15" w:name="_Toc240551885"/>
       <w:r>
         <w:rPr>
           <w:noProof/>
         </w:rPr>
         <w:lastRenderedPageBreak/>
         <w:drawing>
-          <wp:anchor distT="0" distB="0" distL="114300" distR="114300" simplePos="0" relativeHeight="251658240" behindDoc="1" locked="0" layoutInCell="1" allowOverlap="1" wp14:anchorId="2CC0300D" wp14:editId="59E1992E">
+          <wp:anchor distT="0" distB="0" distL="114300" distR="114300" simplePos="0" relativeHeight="251658240" behindDoc="1" locked="0" layoutInCell="1" allowOverlap="1" wp14:anchorId="2CC0300D" wp14:editId="297E4608">
             <wp:simplePos x="0" y="0"/>
             <wp:positionH relativeFrom="margin">
               <wp:align>center</wp:align>
@@ -2457,10 +2308,15 @@
       <w:bookmarkEnd w:id="15"/>
     </w:p>
     <w:p>
+      <w:r>
+        <w:t>The three studies do not solve exactly the same problem. The pit-stop study helps with race context, the SCITEPRESS study is closer to lap-time prediction, and the tyre-degradation study supports analysing tyre and stint behaviour. Their results are useful references, but they are not expected metrics for this project because the data and prediction setup are different (Sasikumar et al., 2025; Pendharkar et al., 2025; Cappello &amp; Hoegh, 2026).</w:t>
+      </w:r>
+    </w:p>
+    <w:p>
       <w:pPr>
         <w:pStyle w:val="Heading1"/>
       </w:pPr>
-      <w:bookmarkStart w:id="16" w:name="_Toc240296940"/>
+      <w:bookmarkStart w:id="16" w:name="_Toc240551886"/>
       <w:r>
         <w:t>Target Variable</w:t>
       </w:r>
@@ -2476,7 +2332,7 @@
     </w:p>
     <w:p>
       <w:r>
-        <w:t>The model will use previous lap times, tyre degradations, weather conditions, fuel load, driver, car, team, circuit and stint to predict the next lap time.</w:t>
+        <w:t>The model will use previous lap times, tyre degradations, weather conditions, driver, car, team, circuit and stint to predict the next lap time.</w:t>
       </w:r>
     </w:p>
     <w:p>
@@ -2499,7 +2355,7 @@
       <w:pPr>
         <w:pStyle w:val="Heading1"/>
       </w:pPr>
-      <w:bookmarkStart w:id="17" w:name="_Toc240296941"/>
+      <w:bookmarkStart w:id="17" w:name="_Toc240551887"/>
       <w:r>
         <w:t>Data Requirements</w:t>
       </w:r>
@@ -2627,6 +2483,7 @@
         </w:numPr>
       </w:pPr>
       <w:r>
+        <w:lastRenderedPageBreak/>
         <w:t>Rainfall</w:t>
       </w:r>
     </w:p>
@@ -2651,9 +2508,8 @@
       <w:pPr>
         <w:pStyle w:val="Heading1"/>
       </w:pPr>
-      <w:bookmarkStart w:id="18" w:name="_Toc240296942"/>
-      <w:r>
-        <w:lastRenderedPageBreak/>
+      <w:bookmarkStart w:id="18" w:name="_Toc240551888"/>
+      <w:r>
         <w:t>Conclusion</w:t>
       </w:r>
       <w:bookmarkEnd w:id="18"/>
@@ -2672,24 +2528,20 @@
       <w:pPr>
         <w:pStyle w:val="Heading1"/>
       </w:pPr>
-      <w:bookmarkStart w:id="19" w:name="_Toc240296943"/>
+      <w:bookmarkStart w:id="19" w:name="_Toc240551889"/>
       <w:r>
         <w:t>References</w:t>
       </w:r>
       <w:bookmarkEnd w:id="19"/>
     </w:p>
     <w:p>
-      <w:pPr>
-        <w:pStyle w:val="Heading2"/>
-      </w:pPr>
-      <w:bookmarkStart w:id="20" w:name="_Toc240296944"/>
-      <w:r>
-        <w:t>Domain Documents/Methods</w:t>
-      </w:r>
-      <w:bookmarkEnd w:id="20"/>
-    </w:p>
-    <w:p>
-      <w:hyperlink r:id="rId7" w:history="1">
+      <w:r>
+        <w:t>Sasikumar et al. (2025), Data-driven pit stop decision support for Formula 1 using deep learning models</w:t>
+      </w:r>
+      <w:r>
+        <w:br/>
+      </w:r>
+      <w:hyperlink r:id="rId7" w:tgtFrame="_new" w:history="1">
         <w:r>
           <w:rPr>
             <w:rStyle w:val="Hyperlink"/>
@@ -2697,28 +2549,30 @@
           <w:t>https://www.frontiersin.org/journals/artificial-intelligence/articles/10.3389/frai.2025.1673148/full</w:t>
         </w:r>
       </w:hyperlink>
-      <w:r>
-        <w:t xml:space="preserve"> - pit stops effect</w:t>
-      </w:r>
-    </w:p>
-    <w:p>
-      <w:hyperlink r:id="rId8" w:history="1">
-        <w:r>
-          <w:rPr>
-            <w:rStyle w:val="Hyperlink"/>
-          </w:rPr>
-          <w:t>https://www.scitepress.org/Papers/2025/146888/146888.pdf</w:t>
-        </w:r>
-      </w:hyperlink>
-      <w:r>
-        <w:t xml:space="preserve"> - main</w:t>
-      </w:r>
-      <w:r>
-        <w:t xml:space="preserve"> pdf for lap time prediction</w:t>
-      </w:r>
-    </w:p>
-    <w:p>
-      <w:hyperlink r:id="rId9" w:history="1">
+    </w:p>
+    <w:p>
+      <w:r>
+        <w:t>Pendharkar et al. (2025), Statistical race simulations and accuracy analysis of lap times and pit stops in Formula One</w:t>
+      </w:r>
+      <w:r>
+        <w:br/>
+        <w:t>https://www.scitepress.org/Papers/2025/146888/146888.pdf</w:t>
+      </w:r>
+    </w:p>
+    <w:p>
+      <w:r>
+        <w:t xml:space="preserve">Cappello &amp; Hoegh (2026), A state-space approach to </w:t>
+      </w:r>
+      <w:r>
+        <w:t>modelling</w:t>
+      </w:r>
+      <w:r>
+        <w:t xml:space="preserve"> tire degradation in Formula 1 racing</w:t>
+      </w:r>
+      <w:r>
+        <w:br/>
+      </w:r>
+      <w:hyperlink r:id="rId8" w:tgtFrame="_new" w:history="1">
         <w:r>
           <w:rPr>
             <w:rStyle w:val="Hyperlink"/>
@@ -2726,48 +2580,53 @@
           <w:t>https://journals.sagepub.com/doi/full/10.1177/22150218261446170</w:t>
         </w:r>
       </w:hyperlink>
-      <w:r>
-        <w:t xml:space="preserve"> - tyre degradation</w:t>
-      </w:r>
-    </w:p>
-    <w:p>
-      <w:pPr>
-        <w:pStyle w:val="Heading2"/>
-      </w:pPr>
-      <w:bookmarkStart w:id="21" w:name="_Toc240296945"/>
-      <w:r>
-        <w:t>Dataset</w:t>
-      </w:r>
-      <w:r>
-        <w:t>s</w:t>
-      </w:r>
-      <w:bookmarkEnd w:id="21"/>
-    </w:p>
-    <w:p>
-      <w:hyperlink r:id="rId10" w:history="1">
+    </w:p>
+    <w:p>
+      <w:r>
+        <w:t>FastF1 Documentation</w:t>
+      </w:r>
+      <w:r>
+        <w:br/>
+      </w:r>
+      <w:hyperlink r:id="rId9" w:tgtFrame="_new" w:history="1">
         <w:r>
           <w:rPr>
             <w:rStyle w:val="Hyperlink"/>
           </w:rPr>
-          <w:t>https://www.kaggle.com/datasets/navenkumar1998/formula-1-dataset-with-weather-and-tyre-features/data</w:t>
+          <w:t>https://docs.fastf1.dev/</w:t>
         </w:r>
       </w:hyperlink>
-      <w:r>
-        <w:t xml:space="preserve"> </w:t>
-      </w:r>
-    </w:p>
-    <w:p>
-      <w:hyperlink r:id="rId11" w:history="1">
+    </w:p>
+    <w:p>
+      <w:pPr>
+        <w:rPr>
+          <w:b/>
+          <w:bCs/>
+        </w:rPr>
+      </w:pPr>
+      <w:r>
+        <w:rPr>
+          <w:b/>
+          <w:bCs/>
+        </w:rPr>
+        <w:t>Additional Resource</w:t>
+      </w:r>
+    </w:p>
+    <w:p>
+      <w:r>
+        <w:t>Cappello, F1_SSM_Paper</w:t>
+      </w:r>
+      <w:r>
+        <w:br/>
+      </w:r>
+      <w:hyperlink r:id="rId10" w:tgtFrame="_new" w:history="1">
         <w:r>
           <w:rPr>
             <w:rStyle w:val="Hyperlink"/>
           </w:rPr>
-          <w:t>https://github.com/colecappello12/F1_SSM_Paper?</w:t>
+          <w:t>https://github.com/colecappello12/F1_SSM_Paper</w:t>
         </w:r>
       </w:hyperlink>
-      <w:r>
-        <w:t xml:space="preserve"> </w:t>
-      </w:r>
     </w:p>
     <w:p/>
     <w:sectPr>
@@ -4174,7 +4033,6 @@
   <w:style w:type="character" w:default="1" w:styleId="DefaultParagraphFont">
     <w:name w:val="Default Paragraph Font"/>
     <w:uiPriority w:val="1"/>
-    <w:semiHidden/>
     <w:unhideWhenUsed/>
   </w:style>
   <w:style w:type="table" w:default="1" w:styleId="TableNormal">

</xml_diff>